<commit_message>
MB001 #363: atomic correction candidate
</commit_message>
<xml_diff>
--- a/tools/candidates/s1-oplata-za-raboty/09-pretenziya.docx
+++ b/tools/candidates/s1-oplata-za-raboty/09-pretenziya.docx
@@ -51,6 +51,14 @@
       </w:pPr>
       <w:r>
         <w:t>Сумма долга — бесспорная, из реестра взаиморасчётов (файл 04), за вычетом всех оплат и зачтённого аванса. Спорные суммы (границы B2 и B5) в претензию без оценки специалиста не включайте; акты, оспоренные заказчиком (граница B4), — тоже.</w:t>
+      </w:r>
+    </w:p>
+    <w:p>
+      <w:pPr>
+        <w:pStyle w:val="ListBullet"/>
+      </w:pPr>
+      <w:r>
+        <w:t>Сверка перед отправкой: {{СУММА_ДОЛГА}} = «Долг на последний день расчёта» файла 08 (лист «Расчёт») = «БЕССПОРНАЯ ЧАСТЬ» файла 04 (лист «Взаиморасчёты», ячейка M12) за вычетом актов, не вошедших в расчёт (файл 08, лист «Ввод»). Не совпадает или в файле 08 строка «Сверка с бесспорной частью файла 04» не «ок» — претензию не отправляйте: в расчёт попала спорная часть или общий долг.</w:t>
       </w:r>
     </w:p>
     <w:p>

</xml_diff>

<commit_message>
S1 doc09: correct source-bound interest and pretrial conditions
</commit_message>
<xml_diff>
--- a/tools/candidates/s1-oplata-za-raboty/09-pretenziya.docx
+++ b/tools/candidates/s1-oplata-za-raboty/09-pretenziya.docx
@@ -15,7 +15,7 @@
         <w:rPr>
           <w:i/>
         </w:rPr>
-        <w:t>Файл 09. Досудебное требование. Претензионный порядок для денежных требований из договора установлен ч. 5 ст. 4 АПК РФ; срок, по истечении которого можно обращаться в суд, — из договора, а если его нет — из этой нормы, со дня направления претензии.</w:t>
+        <w:t>Файл 09. Досудебное требование. Претензионный порядок для денежных требований из договора установлен ч. 5 ст. 4 АПК РФ; срок, по истечении которого можно обращаться в суд, — из договора или закона, если ими установлен иной срок, а иначе — из этой нормы, со дня направления претензии.</w:t>
       </w:r>
     </w:p>
     <w:p>
@@ -82,7 +82,15 @@
         <w:pStyle w:val="ListBullet"/>
       </w:pPr>
       <w:r>
-        <w:t>Если договор устанавливает неустойку за просрочку оплаты — выбор между неустойкой и процентами (п. 4 ст. 395 ГК РФ) согласуйте со специалистом.</w:t>
+        <w:t>Если договор устанавливает неустойку за просрочку оплаты, проценты по ст. 395 ГК РФ по общему правилу не взыскиваются, если иное не предусмотрено законом или договором (п. 4 ст. 395 ГК РФ). В этом случае п. 3 претензии и расчёт файла 08 без оценки специалиста не используйте.</w:t>
+      </w:r>
+    </w:p>
+    <w:p>
+      <w:pPr>
+        <w:pStyle w:val="ListBullet"/>
+      </w:pPr>
+      <w:r>
+        <w:t>Если закон или договор устанавливает иной размер процентов либо закон, иной правовой акт или договор ограничивает период их начисления, расчёт по ключевой ставке (файл 08) без оценки специалиста не используйте (п. 1 и 3 ст. 395 ГК РФ).</w:t>
       </w:r>
     </w:p>
     <w:p>
@@ -1354,7 +1362,7 @@
         <w:pStyle w:val="ListBullet"/>
       </w:pPr>
       <w:r>
-        <w:t>Срок, который вы назначили заказчику, и срок, по истечении которого можно обращаться в суд, — разные сроки. Второй считается со дня направления претензии и определяется договором или ч. 5 ст. 4 АПК РФ; назначенный вами более короткий срок его не сокращает.</w:t>
+        <w:t>Срок, который вы назначили заказчику, и срок, по истечении которого можно обращаться в суд, — разные сроки. Второй считается со дня направления претензии и определяется договором или законом, а если ими не установлен иной срок — ч. 5 ст. 4 АПК РФ; назначенный вами более короткий срок его не сокращает.</w:t>
       </w:r>
     </w:p>
     <w:sectPr>

</xml_diff>